<commit_message>
docs(irb): genericize headset name to mixed-reality head-mounted display
Replace all "HTC Vive Focus Vision" references with generic "mixed-reality
head-mounted display" across source docs, the filled HRP-502/HRP-503, and
the generated packet, to avoid device-specific IRB amendments.

Co-Authored-By: Claude Opus 4.8 <noreply@anthropic.com>
</commit_message>
<xml_diff>
--- a/docs/irb/submission/HRP-502_Gaze_Contingency_Adult_Consent.docx
+++ b/docs/irb/submission/HRP-502_Gaze_Contingency_Adult_Consent.docx
@@ -188,7 +188,7 @@
           <w:rFonts w:ascii="Arial" w:hAnsi="Arial"/>
           <w:b w:val="0"/>
         </w:rPr>
-        <w:t>. While seated, you will wear an HTC Vive Focus Vision headset and turn to search for virtual colored shapes arranged around you. You will complete practice followed by four search blocks with up to 16 trials each (up to 64 experimental trials total), receive spoken hints, answer questionnaires, and provide about 1–2 minutes of your own speech. Your session may contain fewer trials if you stop, experience discomfort, encounter a technical problem, or reach the visit-time limit. Offline software on a UCF-managed research computer will use that recording to make a private synthetic voice that resembles you and can say study phrases you did not record. Your recording and synthetic voice will not be sent to an outside voice service.</w:t>
+        <w:t>. While seated, you will wear a mixed-reality head-mounted display and turn to search for virtual colored shapes arranged around you. You will complete practice followed by four search blocks with up to 16 trials each (up to 64 experimental trials total), receive spoken hints, answer questionnaires, and provide about 1–2 minutes of your own speech. Your session may contain fewer trials if you stop, experience discomfort, encounter a technical problem, or reach the visit-time limit. Offline software on a UCF-managed research computer will use that recording to make a private synthetic voice that resembles you and can say study phrases you did not record. Your recording and synthetic voice will not be sent to an outside voice service.</w:t>
       </w:r>
     </w:p>
     <w:p>
@@ -565,7 +565,7 @@
           <w:rFonts w:ascii="Arial" w:hAnsi="Arial"/>
           <w:b w:val="0"/>
         </w:rPr>
-        <w:t>5. Seat you at a marked position, fit and calibrate the HTC Vive Focus Vision headset, and check that you can comfortably turn to view the search area around you. The headset uses cameras to show your surroundings and eye tracking to estimate where you look. The study application does not save room video, face video, webcam video, or raw eye-camera images.</w:t>
+        <w:t>5. Seat you at a marked position, fit and calibrate the mixed-reality head-mounted display, and check that you can comfortably turn to view the search area around you. The headset uses cameras to show your surroundings and eye tracking to estimate where you look. The study application does not save room video, face video, webcam video, or raw eye-camera images.</w:t>
       </w:r>
     </w:p>
     <w:p>

</xml_diff>